<commit_message>
fix(docs): SC Audit Log là thư mục rỗng, không phải DocType + dọn ref treo
- §M0 bỏ dòng "SC Audit Log" (thư mục supplycore/doctype/audit_log chỉ có
  __init__.py, không schema/controller, không hàm nào tham chiếu). Chuyển sang
  §24 cùng alert_rule như hạng mục "Chưa có"; nêu rõ nhật ký kiểm toán hiện
  dựa trên bản ghi Version sẵn có của Frappe (§21).
- Footer nêu rõ tài liệu mô tả cả phần chưa commit trong thư mục làm việc,
  nên đi trước nhánh feat/mvl-distributor.
- Sửa 4 docstring trỏ tới tài liệu vừa xóa (MAIN_FLOW.md, UAT_PROCEDURE.md,
  E2E_MAIN_FLOW_SCENARIO.md) → trỏ về tài liệu BA.

Co-Authored-By: Claude Opus 5 (1M context) <noreply@anthropic.com>
</commit_message>
<xml_diff>
--- a/docs/ba-miyano/SupplyCore_MVL_BA.docx
+++ b/docs/ba-miyano/SupplyCore_MVL_BA.docx
@@ -6793,54 +6793,6 @@
                 <w:color w:val="15233F"/>
                 <w:sz w:val="18"/>
               </w:rPr>
-              <w:t>SC Audit Log</w:t>
-            </w:r>
-          </w:p>
-        </w:tc>
-        <w:tc>
-          <w:tcPr>
-            <w:tcW w:type="dxa" w:w="2880"/>
-          </w:tcPr>
-          <w:p>
-            <w:r/>
-            <w:r>
-              <w:rPr>
-                <w:color w:val="15233F"/>
-                <w:sz w:val="18"/>
-              </w:rPr>
-              <w:t>Nhật ký thao tác</w:t>
-            </w:r>
-          </w:p>
-        </w:tc>
-        <w:tc>
-          <w:tcPr>
-            <w:tcW w:type="dxa" w:w="2880"/>
-          </w:tcPr>
-          <w:p>
-            <w:r/>
-            <w:r>
-              <w:rPr>
-                <w:color w:val="15233F"/>
-                <w:sz w:val="18"/>
-              </w:rPr>
-              <w:t>Ghi hành vi nhạy cảm; nguồn cho điều tra (M10) &amp; kiểm toán.</w:t>
-            </w:r>
-          </w:p>
-        </w:tc>
-      </w:tr>
-      <w:tr>
-        <w:tc>
-          <w:tcPr>
-            <w:tcW w:type="dxa" w:w="2880"/>
-          </w:tcPr>
-          <w:p>
-            <w:r/>
-            <w:r>
-              <w:rPr>
-                <w:b/>
-                <w:color w:val="15233F"/>
-                <w:sz w:val="18"/>
-              </w:rPr>
               <w:t>SupplyCore Settings</w:t>
             </w:r>
             <w:r>
@@ -26078,6 +26030,114 @@
                 <w:color w:val="15233F"/>
                 <w:sz w:val="18"/>
               </w:rPr>
+              <w:t>SC Audit Log, Alert Rule (M0)</w:t>
+            </w:r>
+          </w:p>
+        </w:tc>
+        <w:tc>
+          <w:tcPr>
+            <w:tcW w:type="dxa" w:w="2880"/>
+          </w:tcPr>
+          <w:p>
+            <w:r/>
+            <w:r>
+              <w:rPr>
+                <w:rFonts w:ascii="Consolas" w:hAnsi="Consolas"/>
+                <w:color w:val="2456C9"/>
+                <w:sz w:val="16"/>
+              </w:rPr>
+              <w:t>Chưa có</w:t>
+            </w:r>
+          </w:p>
+        </w:tc>
+        <w:tc>
+          <w:tcPr>
+            <w:tcW w:type="dxa" w:w="2880"/>
+          </w:tcPr>
+          <w:p>
+            <w:r/>
+            <w:r>
+              <w:rPr>
+                <w:color w:val="15233F"/>
+                <w:sz w:val="18"/>
+              </w:rPr>
+              <w:t xml:space="preserve">Thư mục DocType rỗng (chỉ có </w:t>
+            </w:r>
+            <w:r>
+              <w:rPr>
+                <w:rFonts w:ascii="Consolas" w:hAnsi="Consolas"/>
+                <w:color w:val="2456C9"/>
+                <w:sz w:val="16"/>
+              </w:rPr>
+              <w:t>__init__.py</w:t>
+            </w:r>
+            <w:r>
+              <w:rPr>
+                <w:color w:val="15233F"/>
+                <w:sz w:val="18"/>
+              </w:rPr>
+              <w:t xml:space="preserve">, không có schema/controller) và không hàm nào tham chiếu. Nhật ký kiểm toán hiện dựa trên </w:t>
+            </w:r>
+            <w:r>
+              <w:rPr>
+                <w:b/>
+                <w:color w:val="15233F"/>
+                <w:sz w:val="18"/>
+              </w:rPr>
+              <w:t>bản ghi phiên bản (Version) sẵn có của Frappe</w:t>
+            </w:r>
+            <w:r>
+              <w:rPr>
+                <w:color w:val="15233F"/>
+                <w:sz w:val="18"/>
+              </w:rPr>
+              <w:t xml:space="preserve"> — xem §21; cấu hình cảnh báo dùng </w:t>
+            </w:r>
+            <w:r>
+              <w:rPr>
+                <w:rFonts w:ascii="Consolas" w:hAnsi="Consolas"/>
+                <w:color w:val="2456C9"/>
+                <w:sz w:val="16"/>
+              </w:rPr>
+              <w:t>SC Alert Rule</w:t>
+            </w:r>
+            <w:r>
+              <w:rPr>
+                <w:color w:val="15233F"/>
+                <w:sz w:val="18"/>
+              </w:rPr>
+              <w:t xml:space="preserve"> ở M11. Tham số </w:t>
+            </w:r>
+            <w:r>
+              <w:rPr>
+                <w:rFonts w:ascii="Consolas" w:hAnsi="Consolas"/>
+                <w:color w:val="2456C9"/>
+                <w:sz w:val="16"/>
+              </w:rPr>
+              <w:t>audit_log_retention_days</w:t>
+            </w:r>
+            <w:r>
+              <w:rPr>
+                <w:color w:val="15233F"/>
+                <w:sz w:val="18"/>
+              </w:rPr>
+              <w:t xml:space="preserve"> trong Settings hiện chưa có DocType tương ứng.</w:t>
+            </w:r>
+          </w:p>
+        </w:tc>
+      </w:tr>
+      <w:tr>
+        <w:tc>
+          <w:tcPr>
+            <w:tcW w:type="dxa" w:w="2880"/>
+          </w:tcPr>
+          <w:p>
+            <w:r/>
+            <w:r>
+              <w:rPr>
+                <w:color w:val="15233F"/>
+                <w:sz w:val="18"/>
+              </w:rPr>
               <w:t>Báo cáo tài chính chi tiết (M8)</w:t>
             </w:r>
           </w:p>
@@ -27059,7 +27119,7 @@
                 <w:color w:val="15233F"/>
                 <w:sz w:val="18"/>
               </w:rPr>
-              <w:t xml:space="preserve"> BRU-CUS-001, BRU-INV-002, BRU-SEC-001, SC-E-FC-STAGE, SC-E-PE-PAYMENT-HOLD, SC-E-FC-BULK-ROLE vào danh mục quy tắc; Demand Forecast &amp; Goods Receipt Discrepancy vào danh sách stub; bổ sung DocType nền còn thiếu (SC Department, SC Item Barcode, SC UOM, SC Supplier Item Group, SC Audit Log, SC QI Reading, SC Payment Reference, Putaway Rule). </w:t>
+              <w:t xml:space="preserve"> BRU-CUS-001, BRU-INV-002, BRU-SEC-001, SC-E-FC-STAGE, SC-E-PE-PAYMENT-HOLD, SC-E-FC-BULK-ROLE vào danh mục quy tắc; Demand Forecast &amp; Goods Receipt Discrepancy vào danh sách stub; bổ sung DocType nền còn thiếu (SC Department, SC Item Barcode, SC UOM, SC Supplier Item Group, SC QI Reading, SC Payment Reference, Putaway Rule). </w:t>
             </w:r>
           </w:p>
         </w:tc>
@@ -27105,7 +27165,47 @@
           <w:color w:val="15233F"/>
           <w:sz w:val="21"/>
         </w:rPr>
-        <w:t xml:space="preserve"> (2026-08-03). Khi hệ thống thay đổi, code sống là chuẩn — tài liệu cần cập nhật theo.</w:t>
+        <w:t xml:space="preserve"> tại thời điểm 2026-08-03, </w:t>
+      </w:r>
+      <w:r>
+        <w:rPr>
+          <w:b/>
+          <w:color w:val="15233F"/>
+          <w:sz w:val="21"/>
+        </w:rPr>
+        <w:t>bao gồm cả phần đang trong thư mục làm việc chưa commit</w:t>
+      </w:r>
+      <w:r>
+        <w:rPr>
+          <w:color w:val="15233F"/>
+          <w:sz w:val="21"/>
+        </w:rPr>
+        <w:t xml:space="preserve"> (soạn hàng &amp; quét xác nhận, đơn vị kép, hệ thống email, duyệt hàng loạt, thanh toán 1 chạm). Tài liệu mô tả hệ thống </w:t>
+      </w:r>
+      <w:r>
+        <w:rPr>
+          <w:i/>
+          <w:color w:val="15233F"/>
+          <w:sz w:val="21"/>
+        </w:rPr>
+        <w:t>đang chạy</w:t>
+      </w:r>
+      <w:r>
+        <w:rPr>
+          <w:color w:val="15233F"/>
+          <w:sz w:val="21"/>
+        </w:rPr>
+        <w:t>, nên đi trước nhánh cho tới khi các thay đổi đó được commit.</w:t>
+      </w:r>
+      <w:r>
+        <w:br/>
+      </w:r>
+      <w:r>
+        <w:rPr>
+          <w:color w:val="15233F"/>
+          <w:sz w:val="21"/>
+        </w:rPr>
+        <w:t xml:space="preserve"> Khi hệ thống thay đổi, code sống là chuẩn — tài liệu cần cập nhật theo.</w:t>
       </w:r>
     </w:p>
     <w:sectPr>

</xml_diff>

<commit_message>
docs: đồng bộ nhãn nút "Tạo phiếu giao (soạn hàng)" đúng như trên SPA
Đã đối chiếu frontend/src/actions.js: nút trên màn Đơn hàng bán truyền sẵn
fixedArgs {submit: 0} và DocView mount PickingPanel cho SC Delivery Note —
xác nhận luồng soạn hàng LÀ luồng vận hành mặc định (submit=1 chỉ dành cho
seed/test), đúng như hai tài liệu mô tả.

- Hướng dẫn sử dụng 3.7.3.4 + tra cứu nhanh 4.1.5: dùng đúng nhãn nút đầy đủ.
- Tài liệu BA §12: nêu rõ nút trên SPA truyền sẵn submit=0.
- Chú thích ảnh ở M5 (trước trỏ ảnh phiếu cấp phát đã xóa) viết lại theo
  bảng Hướng dẫn lấy hàng trên phiếu giao.

Co-Authored-By: Claude Opus 5 (1M context) <noreply@anthropic.com>
</commit_message>
<xml_diff>
--- a/docs/ba-miyano/SupplyCore_MVL_BA.docx
+++ b/docs/ba-miyano/SupplyCore_MVL_BA.docx
@@ -14079,7 +14079,7 @@
           <w:color w:val="15233F"/>
           <w:sz w:val="21"/>
         </w:rPr>
-        <w:t xml:space="preserve">Trước đây "Tạo phiếu giao" tạo </w:t>
+        <w:t xml:space="preserve">Trước đây nút "Tạo phiếu giao" tạo </w:t>
       </w:r>
       <w:r>
         <w:rPr>
@@ -14311,10 +14311,26 @@
             <w:r/>
             <w:r>
               <w:rPr>
-                <w:color w:val="15233F"/>
-                <w:sz w:val="18"/>
-              </w:rPr>
-              <w:t>Vận hành thật ở kho</w:t>
+                <w:b/>
+                <w:color w:val="15233F"/>
+                <w:sz w:val="18"/>
+              </w:rPr>
+              <w:t>Luồng vận hành thật</w:t>
+            </w:r>
+            <w:r>
+              <w:rPr>
+                <w:color w:val="15233F"/>
+                <w:sz w:val="18"/>
+              </w:rPr>
+              <w:t xml:space="preserve"> — nút "Tạo phiếu giao (soạn hàng)" trên SPA truyền sẵn </w:t>
+            </w:r>
+            <w:r>
+              <w:rPr>
+                <w:rFonts w:ascii="Consolas" w:hAnsi="Consolas"/>
+                <w:color w:val="2456C9"/>
+                <w:sz w:val="16"/>
+              </w:rPr>
+              <w:t>submit=0</w:t>
             </w:r>
           </w:p>
         </w:tc>

</xml_diff>

<commit_message>
docs(ba): tài liệu và nhánh đã khớp — bỏ ghi chú "đi trước nhánh"
Phần code v1.1 mô tả (soạn hàng quét xác nhận, đơn vị kép, email thông báo,
duyệt hàng loạt, thanh toán 1 chạm) đã commit ở 705ffad, nên ghi chú "bao gồm
cả phần chưa commit" ở footer không còn đúng.

Co-Authored-By: Claude Opus 5 (1M context) <noreply@anthropic.com>
</commit_message>
<xml_diff>
--- a/docs/ba-miyano/SupplyCore_MVL_BA.docx
+++ b/docs/ba-miyano/SupplyCore_MVL_BA.docx
@@ -27181,7 +27181,7 @@
           <w:color w:val="15233F"/>
           <w:sz w:val="21"/>
         </w:rPr>
-        <w:t xml:space="preserve"> tại thời điểm 2026-08-03, </w:t>
+        <w:t xml:space="preserve"> tại thời điểm 2026-08-03. Toàn bộ phần nghiệp vụ mô tả ở v1.1 (soạn hàng &amp; quét xác nhận, đơn vị kép, hệ thống email, duyệt hàng loạt, thanh toán 1 chạm) </w:t>
       </w:r>
       <w:r>
         <w:rPr>
@@ -27189,29 +27189,14 @@
           <w:color w:val="15233F"/>
           <w:sz w:val="21"/>
         </w:rPr>
-        <w:t>bao gồm cả phần đang trong thư mục làm việc chưa commit</w:t>
+        <w:t>đã được commit lên nhánh</w:t>
       </w:r>
       <w:r>
         <w:rPr>
           <w:color w:val="15233F"/>
           <w:sz w:val="21"/>
         </w:rPr>
-        <w:t xml:space="preserve"> (soạn hàng &amp; quét xác nhận, đơn vị kép, hệ thống email, duyệt hàng loạt, thanh toán 1 chạm). Tài liệu mô tả hệ thống </w:t>
-      </w:r>
-      <w:r>
-        <w:rPr>
-          <w:i/>
-          <w:color w:val="15233F"/>
-          <w:sz w:val="21"/>
-        </w:rPr>
-        <w:t>đang chạy</w:t>
-      </w:r>
-      <w:r>
-        <w:rPr>
-          <w:color w:val="15233F"/>
-          <w:sz w:val="21"/>
-        </w:rPr>
-        <w:t>, nên đi trước nhánh cho tới khi các thay đổi đó được commit.</w:t>
+        <w:t xml:space="preserve"> — tài liệu và mã nguồn hiện khớp nhau.</w:t>
       </w:r>
       <w:r>
         <w:br/>

</xml_diff>